<commit_message>
Docs: project overview — market-agnostic wording, real diagram, PDF
Remove destination-specific framing (the product is market-agnostic;
destination port, customs formulas, currency and languages are per-tenant
config — Spain called out as an example EU market). Replace the ASCII
architecture diagram with a proper boxes-and-arrows diagram (mermaid in
the md, styled tables in the docx, flexbox in the PDF). Add a designed
PDF version (HTML + headless Chrome) matching the team's reference
overview PDFs; docx regenerated to match.

Co-Authored-By: Claude Fable 5 <noreply@anthropic.com>
</commit_message>
<xml_diff>
--- a/docs/GECX_AI_Auto_Broker_Project_Overview.docx
+++ b/docs/GECX_AI_Auto_Broker_Project_Overview.docx
@@ -42,7 +42,7 @@
           <w:sz w:val="24"/>
           <w:szCs w:val="24"/>
         </w:rPr>
-        <w:t xml:space="preserve">Conversational agent for importing cars from US auctions to Georgia — project overview</w:t>
+        <w:t xml:space="preserve">Conversational agent for importing cars from US auctions — project overview</w:t>
       </w:r>
     </w:p>
     <w:p>
@@ -129,7 +129,7 @@
           <w:sz w:val="21"/>
           <w:szCs w:val="21"/>
         </w:rPr>
-        <w:t xml:space="preserve">A white-label conversational agent that helps customers import cars from US auctions (Copart/IAAI) to Georgia. Over chat and voice it searches real auction inventory, shows cars with photos and auction links, produces itemized to-the-door cost estimates (Poti port), estimates repair costs — including genuine visual analysis of customer-uploaded damage photos — and hands qualified leads to human brokers. The agent never places bids and never handles payments; a certified broker completes every transaction.</w:t>
+        <w:t xml:space="preserve">A white-label conversational agent that helps customers import cars from US auctions (Copart/IAAI) to their home market. Over chat and voice it searches real auction inventory, shows cars with photos and auction links, produces itemized to-the-door cost estimates for the configured destination port, estimates repair costs — including genuine visual analysis of customer-uploaded damage photos — and hands qualified leads to human brokers. The agent never places bids and never handles payments; a certified broker completes every transaction.</w:t>
       </w:r>
     </w:p>
     <w:p>
@@ -142,7 +142,7 @@
           <w:sz w:val="21"/>
           <w:szCs w:val="21"/>
         </w:rPr>
-        <w:t xml:space="preserve">Built on Google CX Agent Studio (Gemini, natively multimodal). The demo runs a fictional brand (AUTOBROKER.AI / "Caucasus Auto Import") with 58,356 real auction lots, a public website with embedded chat, a landed-cost calculator page, and a broker lead portal. Multi-tenant by design: brand, fees, destination-port formulas, and lead routing are per-client configuration.</w:t>
+        <w:t xml:space="preserve">Built on Google CX Agent Studio (Gemini, natively multimodal). The demo runs a fictional brand (AUTOBROKER.AI) with 58,356 real auction lots, a public website with embedded chat, a landed-cost calculator page, and a broker lead portal. Multi-tenant and market-agnostic by design: brand, languages, fees, destination port, and customs formulas are per-client configuration — the demo is configured for one example corridor, and the same platform serves e.g. a Spanish importer (Valencia/Algeciras port, EU duty + VAT) by configuration alone.</w:t>
       </w:r>
     </w:p>
     <w:p>
@@ -249,7 +249,7 @@
           <w:sz w:val="21"/>
           <w:szCs w:val="21"/>
         </w:rPr>
-        <w:t xml:space="preserve">An itemized to-the-door breakdown: auction fees, inland US towing (region inferred from the yard’s state), ocean freight to Poti, broker service fee, and Georgian customs/excise computed from engine size, vehicle age, and fuel type — using sensible defaults instead of interrogating the customer. Every figure is labeled an estimate that a human broker confirms before any bid.</w:t>
+        <w:t xml:space="preserve">An itemized to-the-door breakdown: auction fees, inland US towing (region inferred from the yard’s state), ocean freight to the destination port, broker service fee, and import duties/taxes computed from the tenant’s customs formulas — for an EU market such as Spain, customs duty + VAT — using sensible defaults instead of interrogating the customer. Every figure is labeled an estimate that a human broker confirms before any bid.</w:t>
       </w:r>
     </w:p>
     <w:p>
@@ -339,7 +339,7 @@
           <w:sz w:val="21"/>
           <w:szCs w:val="21"/>
         </w:rPr>
-        <w:t xml:space="preserve">Text chat is fully functional (English/Georgian). Voice conversation works end-to-end for dialogue; see section 5 for a current platform limitation on voice tool execution.</w:t>
+        <w:t xml:space="preserve">Text chat is fully functional and multilingual (the demo ships two languages; adding a market’s language is configuration). Voice conversation works end-to-end for dialogue; see section 5 for a current platform limitation on voice tool execution.</w:t>
       </w:r>
     </w:p>
     <w:p>
@@ -858,99 +858,465 @@
         <w:t xml:space="preserve">3. How it works</w:t>
       </w:r>
     </w:p>
-    <w:p>
-      <w:pPr>
-        <w:shd w:fill="F2F5F9" w:val="clear"/>
-        <w:spacing w:after="40"/>
-      </w:pPr>
-      <w:r>
-        <w:rPr>
-          <w:rFonts w:ascii="Consolas" w:cs="Consolas" w:eastAsia="Consolas" w:hAnsi="Consolas"/>
-          <w:color w:val="333333"/>
-          <w:sz w:val="17"/>
-          <w:szCs w:val="17"/>
-        </w:rPr>
-        <w:t xml:space="preserve">Customer ↔ Website (chat/voice widget)</w:t>
-      </w:r>
-    </w:p>
-    <w:p>
-      <w:pPr>
-        <w:shd w:fill="F2F5F9" w:val="clear"/>
-        <w:spacing w:after="40"/>
-      </w:pPr>
-      <w:r>
-        <w:rPr>
-          <w:rFonts w:ascii="Consolas" w:cs="Consolas" w:eastAsia="Consolas" w:hAnsi="Consolas"/>
-          <w:color w:val="333333"/>
-          <w:sz w:val="17"/>
-          <w:szCs w:val="17"/>
-        </w:rPr>
-        <w:t xml:space="preserve">        ↔ CX Agent Studio agent (Gemini) — 6 typed tools:</w:t>
-      </w:r>
-    </w:p>
-    <w:p>
-      <w:pPr>
-        <w:shd w:fill="F2F5F9" w:val="clear"/>
-        <w:spacing w:after="40"/>
-      </w:pPr>
-      <w:r>
-        <w:rPr>
-          <w:rFonts w:ascii="Consolas" w:cs="Consolas" w:eastAsia="Consolas" w:hAnsi="Consolas"/>
-          <w:color w:val="333333"/>
-          <w:sz w:val="17"/>
-          <w:szCs w:val="17"/>
-        </w:rPr>
-        <w:t xml:space="preserve">              search_inventory · get_lot · calculate_landing_cost</w:t>
-      </w:r>
-    </w:p>
-    <w:p>
-      <w:pPr>
-        <w:shd w:fill="F2F5F9" w:val="clear"/>
-        <w:spacing w:after="40"/>
-      </w:pPr>
-      <w:r>
-        <w:rPr>
-          <w:rFonts w:ascii="Consolas" w:cs="Consolas" w:eastAsia="Consolas" w:hAnsi="Consolas"/>
-          <w:color w:val="333333"/>
-          <w:sz w:val="17"/>
-          <w:szCs w:val="17"/>
-        </w:rPr>
-        <w:t xml:space="preserve">              estimate_repair_cost · create_lead · update_user_profile</w:t>
-      </w:r>
-    </w:p>
-    <w:p>
-      <w:pPr>
-        <w:shd w:fill="F2F5F9" w:val="clear"/>
-        <w:spacing w:after="40"/>
-      </w:pPr>
-      <w:r>
-        <w:rPr>
-          <w:rFonts w:ascii="Consolas" w:cs="Consolas" w:eastAsia="Consolas" w:hAnsi="Consolas"/>
-          <w:color w:val="333333"/>
-          <w:sz w:val="17"/>
-          <w:szCs w:val="17"/>
-        </w:rPr>
-        <w:t xml:space="preserve">        ↔ Inventory snapshot (58,356 lots, embedded for the demo)</w:t>
-      </w:r>
-    </w:p>
-    <w:p>
-      <w:pPr>
-        <w:shd w:fill="F2F5F9" w:val="clear"/>
-        <w:spacing w:after="40"/>
-      </w:pPr>
-      <w:r>
-        <w:rPr>
-          <w:rFonts w:ascii="Consolas" w:cs="Consolas" w:eastAsia="Consolas" w:hAnsi="Consolas"/>
-          <w:color w:val="333333"/>
-          <w:sz w:val="17"/>
-          <w:szCs w:val="17"/>
-        </w:rPr>
-        <w:t xml:space="preserve">Website renders photos/links per lot number · Broker portal receives leads</w:t>
-      </w:r>
-    </w:p>
-    <w:p>
-      <w:pPr>
-        <w:spacing w:after="60"/>
+    <w:tbl>
+      <w:tblPr>
+        <w:tblW w:type="dxa" w:w="9500"/>
+        <w:tblBorders>
+          <w:top w:val="single" w:color="auto" w:sz="4"/>
+          <w:left w:val="single" w:color="auto" w:sz="4"/>
+          <w:bottom w:val="single" w:color="auto" w:sz="4"/>
+          <w:right w:val="single" w:color="auto" w:sz="4"/>
+          <w:insideH w:val="single" w:color="auto" w:sz="4"/>
+          <w:insideV w:val="single" w:color="auto" w:sz="4"/>
+        </w:tblBorders>
+      </w:tblPr>
+      <w:tblGrid>
+        <w:gridCol w:w="9500"/>
+      </w:tblGrid>
+      <w:tr>
+        <w:tc>
+          <w:tcPr>
+            <w:tcW w:type="dxa" w:w="9500"/>
+            <w:tcBorders>
+              <w:top w:val="single" w:color="073763" w:sz="6"/>
+              <w:left w:val="single" w:color="073763" w:sz="6"/>
+              <w:bottom w:val="single" w:color="073763" w:sz="6"/>
+              <w:right w:val="single" w:color="073763" w:sz="6"/>
+            </w:tcBorders>
+            <w:shd w:fill="F2F5F9" w:val="clear"/>
+            <w:tcMar>
+              <w:top w:type="dxa" w:w="90"/>
+              <w:left w:type="dxa" w:w="140"/>
+              <w:bottom w:type="dxa" w:w="90"/>
+              <w:right w:type="dxa" w:w="140"/>
+            </w:tcMar>
+          </w:tcPr>
+          <w:p>
+            <w:pPr>
+              <w:spacing w:after="20"/>
+              <w:jc w:val="center"/>
+            </w:pPr>
+            <w:r>
+              <w:rPr>
+                <w:rFonts w:ascii="Calibri" w:cs="Calibri" w:eastAsia="Calibri" w:hAnsi="Calibri"/>
+                <w:b/>
+                <w:bCs/>
+                <w:color w:val="073763"/>
+                <w:sz w:val="20"/>
+                <w:szCs w:val="20"/>
+              </w:rPr>
+              <w:t xml:space="preserve">Customer</w:t>
+            </w:r>
+          </w:p>
+          <w:p>
+            <w:pPr>
+              <w:jc w:val="center"/>
+            </w:pPr>
+            <w:r>
+              <w:rPr>
+                <w:rFonts w:ascii="Calibri" w:cs="Calibri" w:eastAsia="Calibri" w:hAnsi="Calibri"/>
+                <w:color w:val="5A6572"/>
+                <w:sz w:val="17"/>
+                <w:szCs w:val="17"/>
+              </w:rPr>
+              <w:t xml:space="preserve">chat &amp; voice on the client website</w:t>
+            </w:r>
+          </w:p>
+        </w:tc>
+      </w:tr>
+    </w:tbl>
+    <w:p>
+      <w:pPr>
+        <w:spacing w:after="40" w:before="40"/>
+        <w:jc w:val="center"/>
+      </w:pPr>
+      <w:r>
+        <w:rPr>
+          <w:rFonts w:ascii="Calibri" w:cs="Calibri" w:eastAsia="Calibri" w:hAnsi="Calibri"/>
+          <w:color w:val="F0076F"/>
+          <w:sz w:val="18"/>
+          <w:szCs w:val="18"/>
+        </w:rPr>
+        <w:t xml:space="preserve">▼</w:t>
+      </w:r>
+    </w:p>
+    <w:tbl>
+      <w:tblPr>
+        <w:tblW w:type="dxa" w:w="9500"/>
+        <w:tblBorders>
+          <w:top w:val="single" w:color="auto" w:sz="4"/>
+          <w:left w:val="single" w:color="auto" w:sz="4"/>
+          <w:bottom w:val="single" w:color="auto" w:sz="4"/>
+          <w:right w:val="single" w:color="auto" w:sz="4"/>
+          <w:insideH w:val="single" w:color="auto" w:sz="4"/>
+          <w:insideV w:val="single" w:color="auto" w:sz="4"/>
+        </w:tblBorders>
+      </w:tblPr>
+      <w:tblGrid>
+        <w:gridCol w:w="9500"/>
+      </w:tblGrid>
+      <w:tr>
+        <w:tc>
+          <w:tcPr>
+            <w:tcW w:type="dxa" w:w="9500"/>
+            <w:tcBorders>
+              <w:top w:val="single" w:color="073763" w:sz="6"/>
+              <w:left w:val="single" w:color="073763" w:sz="6"/>
+              <w:bottom w:val="single" w:color="073763" w:sz="6"/>
+              <w:right w:val="single" w:color="073763" w:sz="6"/>
+            </w:tcBorders>
+            <w:shd w:fill="F2F5F9" w:val="clear"/>
+            <w:tcMar>
+              <w:top w:type="dxa" w:w="90"/>
+              <w:left w:type="dxa" w:w="140"/>
+              <w:bottom w:type="dxa" w:w="90"/>
+              <w:right w:type="dxa" w:w="140"/>
+            </w:tcMar>
+          </w:tcPr>
+          <w:p>
+            <w:pPr>
+              <w:spacing w:after="20"/>
+              <w:jc w:val="center"/>
+            </w:pPr>
+            <w:r>
+              <w:rPr>
+                <w:rFonts w:ascii="Calibri" w:cs="Calibri" w:eastAsia="Calibri" w:hAnsi="Calibri"/>
+                <w:b/>
+                <w:bCs/>
+                <w:color w:val="073763"/>
+                <w:sz w:val="20"/>
+                <w:szCs w:val="20"/>
+              </w:rPr>
+              <w:t xml:space="preserve">AI agent — CX Agent Studio (Gemini)</w:t>
+            </w:r>
+          </w:p>
+          <w:p>
+            <w:pPr>
+              <w:jc w:val="center"/>
+            </w:pPr>
+            <w:r>
+              <w:rPr>
+                <w:rFonts w:ascii="Calibri" w:cs="Calibri" w:eastAsia="Calibri" w:hAnsi="Calibri"/>
+                <w:color w:val="5A6572"/>
+                <w:sz w:val="17"/>
+                <w:szCs w:val="17"/>
+              </w:rPr>
+              <w:t xml:space="preserve">hardened instructions · guardrails · lot memory</w:t>
+            </w:r>
+          </w:p>
+        </w:tc>
+      </w:tr>
+    </w:tbl>
+    <w:p>
+      <w:pPr>
+        <w:spacing w:after="40" w:before="40"/>
+        <w:jc w:val="center"/>
+      </w:pPr>
+      <w:r>
+        <w:rPr>
+          <w:rFonts w:ascii="Calibri" w:cs="Calibri" w:eastAsia="Calibri" w:hAnsi="Calibri"/>
+          <w:color w:val="F0076F"/>
+          <w:sz w:val="18"/>
+          <w:szCs w:val="18"/>
+        </w:rPr>
+        <w:t xml:space="preserve">▼</w:t>
+      </w:r>
+      <w:r>
+        <w:rPr>
+          <w:rFonts w:ascii="Calibri" w:cs="Calibri" w:eastAsia="Calibri" w:hAnsi="Calibri"/>
+          <w:i/>
+          <w:iCs/>
+          <w:color w:val="5A6572"/>
+          <w:sz w:val="16"/>
+          <w:szCs w:val="16"/>
+        </w:rPr>
+        <w:t xml:space="preserve">  6 typed tools</w:t>
+      </w:r>
+    </w:p>
+    <w:tbl>
+      <w:tblPr>
+        <w:tblW w:type="dxa" w:w="9500"/>
+        <w:tblBorders>
+          <w:top w:val="single" w:color="auto" w:sz="4"/>
+          <w:left w:val="single" w:color="auto" w:sz="4"/>
+          <w:bottom w:val="single" w:color="auto" w:sz="4"/>
+          <w:right w:val="single" w:color="auto" w:sz="4"/>
+          <w:insideH w:val="single" w:color="auto" w:sz="4"/>
+          <w:insideV w:val="single" w:color="auto" w:sz="4"/>
+        </w:tblBorders>
+      </w:tblPr>
+      <w:tblGrid>
+        <w:gridCol w:w="9500"/>
+      </w:tblGrid>
+      <w:tr>
+        <w:tc>
+          <w:tcPr>
+            <w:tcW w:type="dxa" w:w="9500"/>
+            <w:tcBorders>
+              <w:top w:val="single" w:color="073763" w:sz="6"/>
+              <w:left w:val="single" w:color="073763" w:sz="6"/>
+              <w:bottom w:val="single" w:color="073763" w:sz="6"/>
+              <w:right w:val="single" w:color="073763" w:sz="6"/>
+            </w:tcBorders>
+            <w:shd w:fill="F2F5F9" w:val="clear"/>
+            <w:tcMar>
+              <w:top w:type="dxa" w:w="90"/>
+              <w:left w:type="dxa" w:w="140"/>
+              <w:bottom w:type="dxa" w:w="90"/>
+              <w:right w:type="dxa" w:w="140"/>
+            </w:tcMar>
+          </w:tcPr>
+          <w:p>
+            <w:pPr>
+              <w:spacing w:after="20"/>
+              <w:jc w:val="center"/>
+            </w:pPr>
+            <w:r>
+              <w:rPr>
+                <w:rFonts w:ascii="Calibri" w:cs="Calibri" w:eastAsia="Calibri" w:hAnsi="Calibri"/>
+                <w:b/>
+                <w:bCs/>
+                <w:color w:val="073763"/>
+                <w:sz w:val="20"/>
+                <w:szCs w:val="20"/>
+              </w:rPr>
+              <w:t xml:space="preserve">Tools</w:t>
+            </w:r>
+          </w:p>
+          <w:p>
+            <w:pPr>
+              <w:jc w:val="center"/>
+            </w:pPr>
+            <w:r>
+              <w:rPr>
+                <w:rFonts w:ascii="Calibri" w:cs="Calibri" w:eastAsia="Calibri" w:hAnsi="Calibri"/>
+                <w:color w:val="5A6572"/>
+                <w:sz w:val="17"/>
+                <w:szCs w:val="17"/>
+              </w:rPr>
+              <w:t xml:space="preserve">search_inventory · get_lot · calculate_landing_cost · estimate_repair_cost · create_lead · update_user_profile</w:t>
+            </w:r>
+          </w:p>
+        </w:tc>
+      </w:tr>
+    </w:tbl>
+    <w:p>
+      <w:pPr>
+        <w:spacing w:after="40" w:before="40"/>
+        <w:jc w:val="center"/>
+      </w:pPr>
+      <w:r>
+        <w:rPr>
+          <w:rFonts w:ascii="Calibri" w:cs="Calibri" w:eastAsia="Calibri" w:hAnsi="Calibri"/>
+          <w:color w:val="F0076F"/>
+          <w:sz w:val="18"/>
+          <w:szCs w:val="18"/>
+        </w:rPr>
+        <w:t xml:space="preserve">▼</w:t>
+      </w:r>
+    </w:p>
+    <w:tbl>
+      <w:tblPr>
+        <w:tblW w:type="dxa" w:w="9500"/>
+        <w:tblBorders>
+          <w:top w:val="single" w:color="auto" w:sz="4"/>
+          <w:left w:val="single" w:color="auto" w:sz="4"/>
+          <w:bottom w:val="single" w:color="auto" w:sz="4"/>
+          <w:right w:val="single" w:color="auto" w:sz="4"/>
+          <w:insideH w:val="single" w:color="auto" w:sz="4"/>
+          <w:insideV w:val="single" w:color="auto" w:sz="4"/>
+        </w:tblBorders>
+      </w:tblPr>
+      <w:tblGrid>
+        <w:gridCol w:w="9500"/>
+      </w:tblGrid>
+      <w:tr>
+        <w:tc>
+          <w:tcPr>
+            <w:tcW w:type="dxa" w:w="9500"/>
+            <w:tcBorders>
+              <w:top w:val="single" w:color="073763" w:sz="6"/>
+              <w:left w:val="single" w:color="073763" w:sz="6"/>
+              <w:bottom w:val="single" w:color="073763" w:sz="6"/>
+              <w:right w:val="single" w:color="073763" w:sz="6"/>
+            </w:tcBorders>
+            <w:shd w:fill="F2F5F9" w:val="clear"/>
+            <w:tcMar>
+              <w:top w:type="dxa" w:w="90"/>
+              <w:left w:type="dxa" w:w="140"/>
+              <w:bottom w:type="dxa" w:w="90"/>
+              <w:right w:type="dxa" w:w="140"/>
+            </w:tcMar>
+          </w:tcPr>
+          <w:p>
+            <w:pPr>
+              <w:spacing w:after="20"/>
+              <w:jc w:val="center"/>
+            </w:pPr>
+            <w:r>
+              <w:rPr>
+                <w:rFonts w:ascii="Calibri" w:cs="Calibri" w:eastAsia="Calibri" w:hAnsi="Calibri"/>
+                <w:b/>
+                <w:bCs/>
+                <w:color w:val="073763"/>
+                <w:sz w:val="20"/>
+                <w:szCs w:val="20"/>
+              </w:rPr>
+              <w:t xml:space="preserve">Inventory</w:t>
+            </w:r>
+          </w:p>
+          <w:p>
+            <w:pPr>
+              <w:jc w:val="center"/>
+            </w:pPr>
+            <w:r>
+              <w:rPr>
+                <w:rFonts w:ascii="Calibri" w:cs="Calibri" w:eastAsia="Calibri" w:hAnsi="Calibri"/>
+                <w:color w:val="5A6572"/>
+                <w:sz w:val="17"/>
+                <w:szCs w:val="17"/>
+              </w:rPr>
+              <w:t xml:space="preserve">demo: embedded snapshot of 58,356 real auction lots</w:t>
+            </w:r>
+          </w:p>
+        </w:tc>
+      </w:tr>
+    </w:tbl>
+    <w:p>
+      <w:pPr>
+        <w:spacing w:after="40" w:before="40"/>
+        <w:jc w:val="center"/>
+      </w:pPr>
+      <w:r>
+        <w:rPr>
+          <w:rFonts w:ascii="Calibri" w:cs="Calibri" w:eastAsia="Calibri" w:hAnsi="Calibri"/>
+          <w:color w:val="F0076F"/>
+          <w:sz w:val="18"/>
+          <w:szCs w:val="18"/>
+        </w:rPr>
+        <w:t xml:space="preserve">▼</w:t>
+      </w:r>
+    </w:p>
+    <w:tbl>
+      <w:tblPr>
+        <w:tblW w:type="dxa" w:w="9500"/>
+        <w:tblBorders>
+          <w:top w:val="single" w:color="auto" w:sz="4"/>
+          <w:left w:val="single" w:color="auto" w:sz="4"/>
+          <w:bottom w:val="single" w:color="auto" w:sz="4"/>
+          <w:right w:val="single" w:color="auto" w:sz="4"/>
+          <w:insideH w:val="single" w:color="auto" w:sz="4"/>
+          <w:insideV w:val="single" w:color="auto" w:sz="4"/>
+        </w:tblBorders>
+      </w:tblPr>
+      <w:tblGrid>
+        <w:gridCol w:w="4650"/>
+        <w:gridCol w:w="4650"/>
+      </w:tblGrid>
+      <w:tr>
+        <w:tc>
+          <w:tcPr>
+            <w:tcW w:type="dxa" w:w="4650"/>
+            <w:tcBorders>
+              <w:top w:val="single" w:color="073763" w:sz="6"/>
+              <w:left w:val="single" w:color="073763" w:sz="6"/>
+              <w:bottom w:val="single" w:color="073763" w:sz="6"/>
+              <w:right w:val="single" w:color="073763" w:sz="6"/>
+            </w:tcBorders>
+            <w:shd w:fill="F2F5F9" w:val="clear"/>
+            <w:tcMar>
+              <w:top w:type="dxa" w:w="90"/>
+              <w:left w:type="dxa" w:w="140"/>
+              <w:bottom w:type="dxa" w:w="90"/>
+              <w:right w:type="dxa" w:w="140"/>
+            </w:tcMar>
+          </w:tcPr>
+          <w:p>
+            <w:pPr>
+              <w:spacing w:after="20"/>
+              <w:jc w:val="center"/>
+            </w:pPr>
+            <w:r>
+              <w:rPr>
+                <w:rFonts w:ascii="Calibri" w:cs="Calibri" w:eastAsia="Calibri" w:hAnsi="Calibri"/>
+                <w:b/>
+                <w:bCs/>
+                <w:color w:val="073763"/>
+                <w:sz w:val="20"/>
+                <w:szCs w:val="20"/>
+              </w:rPr>
+              <w:t xml:space="preserve">Website enrichment</w:t>
+            </w:r>
+          </w:p>
+          <w:p>
+            <w:pPr>
+              <w:jc w:val="center"/>
+            </w:pPr>
+            <w:r>
+              <w:rPr>
+                <w:rFonts w:ascii="Calibri" w:cs="Calibri" w:eastAsia="Calibri" w:hAnsi="Calibri"/>
+                <w:color w:val="5A6572"/>
+                <w:sz w:val="17"/>
+                <w:szCs w:val="17"/>
+              </w:rPr>
+              <w:t xml:space="preserve">photos &amp; auction buttons render under every lot number the agent mentions</w:t>
+            </w:r>
+          </w:p>
+        </w:tc>
+        <w:tc>
+          <w:tcPr>
+            <w:tcW w:type="dxa" w:w="4650"/>
+            <w:tcBorders>
+              <w:top w:val="single" w:color="073763" w:sz="6"/>
+              <w:left w:val="single" w:color="073763" w:sz="6"/>
+              <w:bottom w:val="single" w:color="073763" w:sz="6"/>
+              <w:right w:val="single" w:color="073763" w:sz="6"/>
+            </w:tcBorders>
+            <w:shd w:fill="F2F5F9" w:val="clear"/>
+            <w:tcMar>
+              <w:top w:type="dxa" w:w="90"/>
+              <w:left w:type="dxa" w:w="140"/>
+              <w:bottom w:type="dxa" w:w="90"/>
+              <w:right w:type="dxa" w:w="140"/>
+            </w:tcMar>
+          </w:tcPr>
+          <w:p>
+            <w:pPr>
+              <w:spacing w:after="20"/>
+              <w:jc w:val="center"/>
+            </w:pPr>
+            <w:r>
+              <w:rPr>
+                <w:rFonts w:ascii="Calibri" w:cs="Calibri" w:eastAsia="Calibri" w:hAnsi="Calibri"/>
+                <w:b/>
+                <w:bCs/>
+                <w:color w:val="073763"/>
+                <w:sz w:val="20"/>
+                <w:szCs w:val="20"/>
+              </w:rPr>
+              <w:t xml:space="preserve">Broker portal / CRM</w:t>
+            </w:r>
+          </w:p>
+          <w:p>
+            <w:pPr>
+              <w:jc w:val="center"/>
+            </w:pPr>
+            <w:r>
+              <w:rPr>
+                <w:rFonts w:ascii="Calibri" w:cs="Calibri" w:eastAsia="Calibri" w:hAnsi="Calibri"/>
+                <w:color w:val="5A6572"/>
+                <w:sz w:val="17"/>
+                <w:szCs w:val="17"/>
+              </w:rPr>
+              <w:t xml:space="preserve">receives each captured lead with the exact car, photo and reference</w:t>
+            </w:r>
+          </w:p>
+        </w:tc>
+      </w:tr>
+    </w:tbl>
+    <w:p>
+      <w:pPr>
+        <w:spacing w:after="120"/>
       </w:pPr>
       <w:r>
         <w:rPr>
@@ -1291,7 +1657,7 @@
           <w:sz w:val="21"/>
           <w:szCs w:val="21"/>
         </w:rPr>
-        <w:t xml:space="preserve">Brand and greeting, destination port and customs formulas (supplied by the client’s local brokerage, signed off on worked examples), service fees, callback SLA, languages, lead destination, enabled features.</w:t>
+        <w:t xml:space="preserve">Brand and greeting, destination market — port, customs/duty formulas and currency (supplied by the client’s local brokerage, signed off on worked examples), service fees, callback SLA, languages, lead destination, enabled features.</w:t>
       </w:r>
     </w:p>
     <w:p>

</xml_diff>

<commit_message>
Docs/site: drop "white-label" and multi-tenant claims
The demo is single-brand with a dormant brand parameter — calling it
white-label/multi-tenant overstates what is demonstrated. Describe it
plainly instead: brand, market, fees and customs formulas are per-client
configuration. Scrubbed across the overview (md/docx/pdf regenerated),
integration guide, READMEs, and site footers.

Co-Authored-By: Claude Fable 5 <noreply@anthropic.com>
</commit_message>
<xml_diff>
--- a/docs/GECX_AI_Auto_Broker_Project_Overview.docx
+++ b/docs/GECX_AI_Auto_Broker_Project_Overview.docx
@@ -129,7 +129,7 @@
           <w:sz w:val="21"/>
           <w:szCs w:val="21"/>
         </w:rPr>
-        <w:t xml:space="preserve">A white-label conversational agent that helps customers import cars from US auctions (Copart/IAAI) to their home market. Over chat and voice it searches real auction inventory, shows cars with photos and auction links, produces itemized to-the-door cost estimates for the configured destination port, estimates repair costs — including genuine visual analysis of customer-uploaded damage photos — and hands qualified leads to human brokers. The agent never places bids and never handles payments; a certified broker completes every transaction.</w:t>
+        <w:t xml:space="preserve">A conversational agent that helps customers import cars from US auctions (Copart/IAAI) to their home market. Over chat and voice it searches real auction inventory, shows cars with photos and auction links, produces itemized to-the-door cost estimates for the configured destination port, estimates repair costs — including genuine visual analysis of customer-uploaded damage photos — and hands qualified leads to human brokers. The agent never places bids and never handles payments; a certified broker completes every transaction.</w:t>
       </w:r>
     </w:p>
     <w:p>
@@ -142,7 +142,7 @@
           <w:sz w:val="21"/>
           <w:szCs w:val="21"/>
         </w:rPr>
-        <w:t xml:space="preserve">Built on Google CX Agent Studio (Gemini, natively multimodal). The demo runs a fictional brand (AUTOBROKER.AI) with 58,356 real auction lots, a public website with embedded chat, a landed-cost calculator page, and a broker lead portal. Multi-tenant and market-agnostic by design: brand, languages, fees, destination port, and customs formulas are per-client configuration — the demo is configured for one example corridor, and the same platform serves e.g. a Spanish importer (Valencia/Algeciras port, EU duty + VAT) by configuration alone.</w:t>
+        <w:t xml:space="preserve">Built on Google CX Agent Studio (Gemini, natively multimodal). The demo runs a fictional brand (AUTOBROKER.AI) with 58,356 real auction lots, a public website with embedded chat, a landed-cost calculator page, and a broker lead portal. Brand, languages, fees, destination port, and customs formulas are configuration rather than code — the demo is configured for one example corridor, and the same platform can be configured for other markets (e.g. a Spanish importer: Valencia/Algeciras port, EU duty + VAT).</w:t>
       </w:r>
     </w:p>
     <w:p>
@@ -249,7 +249,7 @@
           <w:sz w:val="21"/>
           <w:szCs w:val="21"/>
         </w:rPr>
-        <w:t xml:space="preserve">An itemized to-the-door breakdown: auction fees, inland US towing (region inferred from the yard’s state), ocean freight to the destination port, broker service fee, and import duties/taxes computed from the tenant’s customs formulas — for an EU market such as Spain, customs duty + VAT — using sensible defaults instead of interrogating the customer. Every figure is labeled an estimate that a human broker confirms before any bid.</w:t>
+        <w:t xml:space="preserve">An itemized to-the-door breakdown: auction fees, inland US towing (region inferred from the yard’s state), ocean freight to the destination port, broker service fee, and import duties/taxes computed from the client’s customs formulas — for an EU market such as Spain, customs duty + VAT — using sensible defaults instead of interrogating the customer. Every figure is labeled an estimate that a human broker confirms before any bid.</w:t>
       </w:r>
     </w:p>
     <w:p>
@@ -1644,7 +1644,7 @@
           <w:sz w:val="24"/>
           <w:szCs w:val="24"/>
         </w:rPr>
-        <w:t xml:space="preserve">4.4 Per-tenant configuration</w:t>
+        <w:t xml:space="preserve">4.4 Per-deployment configuration</w:t>
       </w:r>
     </w:p>
     <w:p>

</xml_diff>

<commit_message>
Docs: reframe guardrails positively for business readers
The guardrails table advertised failure modes ("never invents cars",
"hallucinated car", "fabricated cars get no visuals") — engineering
language that plants doubts a business reader would never have had.
Rewritten as positive assurances: Transactions / Accuracy / Incomplete
data / Customer data / Security / Scope. Media-rendering and agent
bullets softened the same way ("grounded answers", "consistent visuals")
without changing any factual claim. DOCX + PDF regenerated.

Co-Authored-By: Claude Fable 5 <noreply@anthropic.com>
</commit_message>
<xml_diff>
--- a/docs/GECX_AI_Auto_Broker_Project_Overview.docx
+++ b/docs/GECX_AI_Auto_Broker_Project_Overview.docx
@@ -372,13 +372,13 @@
         </w:tblBorders>
       </w:tblPr>
       <w:tblGrid>
-        <w:gridCol w:w="3200"/>
-        <w:gridCol w:w="6300"/>
+        <w:gridCol w:w="2600"/>
+        <w:gridCol w:w="6900"/>
       </w:tblGrid>
       <w:tr>
         <w:tc>
           <w:tcPr>
-            <w:tcW w:type="dxa" w:w="3200"/>
+            <w:tcW w:type="dxa" w:w="2600"/>
             <w:shd w:fill="073763" w:val="clear"/>
             <w:tcMar>
               <w:top w:type="dxa" w:w="70"/>
@@ -397,13 +397,13 @@
                 <w:sz w:val="19"/>
                 <w:szCs w:val="19"/>
               </w:rPr>
-              <w:t xml:space="preserve">Situation</w:t>
-            </w:r>
-          </w:p>
-        </w:tc>
-        <w:tc>
-          <w:tcPr>
-            <w:tcW w:type="dxa" w:w="6300"/>
+              <w:t xml:space="preserve">Topic</w:t>
+            </w:r>
+          </w:p>
+        </w:tc>
+        <w:tc>
+          <w:tcPr>
+            <w:tcW w:type="dxa" w:w="6900"/>
             <w:shd w:fill="073763" w:val="clear"/>
             <w:tcMar>
               <w:top w:type="dxa" w:w="70"/>
@@ -422,7 +422,7 @@
                 <w:sz w:val="19"/>
                 <w:szCs w:val="19"/>
               </w:rPr>
-              <w:t xml:space="preserve">Agent behavior</w:t>
+              <w:t xml:space="preserve">How the agent behaves</w:t>
             </w:r>
           </w:p>
         </w:tc>
@@ -430,49 +430,49 @@
       <w:tr>
         <w:tc>
           <w:tcPr>
-            <w:tcW w:type="dxa" w:w="3200"/>
-            <w:tcMar>
-              <w:top w:type="dxa" w:w="70"/>
-              <w:left w:type="dxa" w:w="110"/>
-              <w:bottom w:type="dxa" w:w="70"/>
-              <w:right w:type="dxa" w:w="110"/>
-            </w:tcMar>
-          </w:tcPr>
-          <w:p>
-            <w:r>
-              <w:rPr>
-                <w:rFonts w:ascii="Calibri" w:cs="Calibri" w:eastAsia="Calibri" w:hAnsi="Calibri"/>
-                <w:b w:val="false"/>
-                <w:bCs w:val="false"/>
-                <w:color w:val="222222"/>
-                <w:sz w:val="19"/>
-                <w:szCs w:val="19"/>
-              </w:rPr>
-              <w:t xml:space="preserve">Bidding, payment, transfers</w:t>
-            </w:r>
-          </w:p>
-        </w:tc>
-        <w:tc>
-          <w:tcPr>
-            <w:tcW w:type="dxa" w:w="6300"/>
-            <w:tcMar>
-              <w:top w:type="dxa" w:w="70"/>
-              <w:left w:type="dxa" w:w="110"/>
-              <w:bottom w:type="dxa" w:w="70"/>
-              <w:right w:type="dxa" w:w="110"/>
-            </w:tcMar>
-          </w:tcPr>
-          <w:p>
-            <w:r>
-              <w:rPr>
-                <w:rFonts w:ascii="Calibri" w:cs="Calibri" w:eastAsia="Calibri" w:hAnsi="Calibri"/>
-                <w:b w:val="false"/>
-                <w:bCs w:val="false"/>
-                <w:color w:val="222222"/>
-                <w:sz w:val="19"/>
-                <w:szCs w:val="19"/>
-              </w:rPr>
-              <w:t xml:space="preserve">Refuses; only a certified human broker transacts</w:t>
+            <w:tcW w:type="dxa" w:w="2600"/>
+            <w:tcMar>
+              <w:top w:type="dxa" w:w="70"/>
+              <w:left w:type="dxa" w:w="110"/>
+              <w:bottom w:type="dxa" w:w="70"/>
+              <w:right w:type="dxa" w:w="110"/>
+            </w:tcMar>
+          </w:tcPr>
+          <w:p>
+            <w:r>
+              <w:rPr>
+                <w:rFonts w:ascii="Calibri" w:cs="Calibri" w:eastAsia="Calibri" w:hAnsi="Calibri"/>
+                <w:b w:val="false"/>
+                <w:bCs w:val="false"/>
+                <w:color w:val="222222"/>
+                <w:sz w:val="19"/>
+                <w:szCs w:val="19"/>
+              </w:rPr>
+              <w:t xml:space="preserve">Transactions</w:t>
+            </w:r>
+          </w:p>
+        </w:tc>
+        <w:tc>
+          <w:tcPr>
+            <w:tcW w:type="dxa" w:w="6900"/>
+            <w:tcMar>
+              <w:top w:type="dxa" w:w="70"/>
+              <w:left w:type="dxa" w:w="110"/>
+              <w:bottom w:type="dxa" w:w="70"/>
+              <w:right w:type="dxa" w:w="110"/>
+            </w:tcMar>
+          </w:tcPr>
+          <w:p>
+            <w:r>
+              <w:rPr>
+                <w:rFonts w:ascii="Calibri" w:cs="Calibri" w:eastAsia="Calibri" w:hAnsi="Calibri"/>
+                <w:b w:val="false"/>
+                <w:bCs w:val="false"/>
+                <w:color w:val="222222"/>
+                <w:sz w:val="19"/>
+                <w:szCs w:val="19"/>
+              </w:rPr>
+              <w:t xml:space="preserve">Never bids and never takes payments — a certified human broker completes every deal</w:t>
             </w:r>
           </w:p>
         </w:tc>
@@ -480,49 +480,49 @@
       <w:tr>
         <w:tc>
           <w:tcPr>
-            <w:tcW w:type="dxa" w:w="3200"/>
-            <w:tcMar>
-              <w:top w:type="dxa" w:w="70"/>
-              <w:left w:type="dxa" w:w="110"/>
-              <w:bottom w:type="dxa" w:w="70"/>
-              <w:right w:type="dxa" w:w="110"/>
-            </w:tcMar>
-          </w:tcPr>
-          <w:p>
-            <w:r>
-              <w:rPr>
-                <w:rFonts w:ascii="Calibri" w:cs="Calibri" w:eastAsia="Calibri" w:hAnsi="Calibri"/>
-                <w:b w:val="false"/>
-                <w:bCs w:val="false"/>
-                <w:color w:val="222222"/>
-                <w:sz w:val="19"/>
-                <w:szCs w:val="19"/>
-              </w:rPr>
-              <w:t xml:space="preserve">Car not in tool results</w:t>
-            </w:r>
-          </w:p>
-        </w:tc>
-        <w:tc>
-          <w:tcPr>
-            <w:tcW w:type="dxa" w:w="6300"/>
-            <w:tcMar>
-              <w:top w:type="dxa" w:w="70"/>
-              <w:left w:type="dxa" w:w="110"/>
-              <w:bottom w:type="dxa" w:w="70"/>
-              <w:right w:type="dxa" w:w="110"/>
-            </w:tcMar>
-          </w:tcPr>
-          <w:p>
-            <w:r>
-              <w:rPr>
-                <w:rFonts w:ascii="Calibri" w:cs="Calibri" w:eastAsia="Calibri" w:hAnsi="Calibri"/>
-                <w:b w:val="false"/>
-                <w:bCs w:val="false"/>
-                <w:color w:val="222222"/>
-                <w:sz w:val="19"/>
-                <w:szCs w:val="19"/>
-              </w:rPr>
-              <w:t xml:space="preserve">Never invented — every car shown comes verbatim from a tool call; the website renders photos only for verified lots, so a hallucinated car would be visibly bare</w:t>
+            <w:tcW w:type="dxa" w:w="2600"/>
+            <w:tcMar>
+              <w:top w:type="dxa" w:w="70"/>
+              <w:left w:type="dxa" w:w="110"/>
+              <w:bottom w:type="dxa" w:w="70"/>
+              <w:right w:type="dxa" w:w="110"/>
+            </w:tcMar>
+          </w:tcPr>
+          <w:p>
+            <w:r>
+              <w:rPr>
+                <w:rFonts w:ascii="Calibri" w:cs="Calibri" w:eastAsia="Calibri" w:hAnsi="Calibri"/>
+                <w:b w:val="false"/>
+                <w:bCs w:val="false"/>
+                <w:color w:val="222222"/>
+                <w:sz w:val="19"/>
+                <w:szCs w:val="19"/>
+              </w:rPr>
+              <w:t xml:space="preserve">Accuracy</w:t>
+            </w:r>
+          </w:p>
+        </w:tc>
+        <w:tc>
+          <w:tcPr>
+            <w:tcW w:type="dxa" w:w="6900"/>
+            <w:tcMar>
+              <w:top w:type="dxa" w:w="70"/>
+              <w:left w:type="dxa" w:w="110"/>
+              <w:bottom w:type="dxa" w:w="70"/>
+              <w:right w:type="dxa" w:w="110"/>
+            </w:tcMar>
+          </w:tcPr>
+          <w:p>
+            <w:r>
+              <w:rPr>
+                <w:rFonts w:ascii="Calibri" w:cs="Calibri" w:eastAsia="Calibri" w:hAnsi="Calibri"/>
+                <w:b w:val="false"/>
+                <w:bCs w:val="false"/>
+                <w:color w:val="222222"/>
+                <w:sz w:val="19"/>
+                <w:szCs w:val="19"/>
+              </w:rPr>
+              <w:t xml:space="preserve">Every vehicle detail, price, and reference number comes directly from inventory and business-system data</w:t>
             </w:r>
           </w:p>
         </w:tc>
@@ -530,49 +530,49 @@
       <w:tr>
         <w:tc>
           <w:tcPr>
-            <w:tcW w:type="dxa" w:w="3200"/>
-            <w:tcMar>
-              <w:top w:type="dxa" w:w="70"/>
-              <w:left w:type="dxa" w:w="110"/>
-              <w:bottom w:type="dxa" w:w="70"/>
-              <w:right w:type="dxa" w:w="110"/>
-            </w:tcMar>
-          </w:tcPr>
-          <w:p>
-            <w:r>
-              <w:rPr>
-                <w:rFonts w:ascii="Calibri" w:cs="Calibri" w:eastAsia="Calibri" w:hAnsi="Calibri"/>
-                <w:b w:val="false"/>
-                <w:bCs w:val="false"/>
-                <w:color w:val="222222"/>
-                <w:sz w:val="19"/>
-                <w:szCs w:val="19"/>
-              </w:rPr>
-              <w:t xml:space="preserve">"What color is it?" (not in data)</w:t>
-            </w:r>
-          </w:p>
-        </w:tc>
-        <w:tc>
-          <w:tcPr>
-            <w:tcW w:type="dxa" w:w="6300"/>
-            <w:tcMar>
-              <w:top w:type="dxa" w:w="70"/>
-              <w:left w:type="dxa" w:w="110"/>
-              <w:bottom w:type="dxa" w:w="70"/>
-              <w:right w:type="dxa" w:w="110"/>
-            </w:tcMar>
-          </w:tcPr>
-          <w:p>
-            <w:r>
-              <w:rPr>
-                <w:rFonts w:ascii="Calibri" w:cs="Calibri" w:eastAsia="Calibri" w:hAnsi="Calibri"/>
-                <w:b w:val="false"/>
-                <w:bCs w:val="false"/>
-                <w:color w:val="222222"/>
-                <w:sz w:val="19"/>
-                <w:szCs w:val="19"/>
-              </w:rPr>
-              <w:t xml:space="preserve">Says the listing doesn’t state it; offers photos or upload — never guesses</w:t>
+            <w:tcW w:type="dxa" w:w="2600"/>
+            <w:tcMar>
+              <w:top w:type="dxa" w:w="70"/>
+              <w:left w:type="dxa" w:w="110"/>
+              <w:bottom w:type="dxa" w:w="70"/>
+              <w:right w:type="dxa" w:w="110"/>
+            </w:tcMar>
+          </w:tcPr>
+          <w:p>
+            <w:r>
+              <w:rPr>
+                <w:rFonts w:ascii="Calibri" w:cs="Calibri" w:eastAsia="Calibri" w:hAnsi="Calibri"/>
+                <w:b w:val="false"/>
+                <w:bCs w:val="false"/>
+                <w:color w:val="222222"/>
+                <w:sz w:val="19"/>
+                <w:szCs w:val="19"/>
+              </w:rPr>
+              <w:t xml:space="preserve">Incomplete data</w:t>
+            </w:r>
+          </w:p>
+        </w:tc>
+        <w:tc>
+          <w:tcPr>
+            <w:tcW w:type="dxa" w:w="6900"/>
+            <w:tcMar>
+              <w:top w:type="dxa" w:w="70"/>
+              <w:left w:type="dxa" w:w="110"/>
+              <w:bottom w:type="dxa" w:w="70"/>
+              <w:right w:type="dxa" w:w="110"/>
+            </w:tcMar>
+          </w:tcPr>
+          <w:p>
+            <w:r>
+              <w:rPr>
+                <w:rFonts w:ascii="Calibri" w:cs="Calibri" w:eastAsia="Calibri" w:hAnsi="Calibri"/>
+                <w:b w:val="false"/>
+                <w:bCs w:val="false"/>
+                <w:color w:val="222222"/>
+                <w:sz w:val="19"/>
+                <w:szCs w:val="19"/>
+              </w:rPr>
+              <w:t xml:space="preserve">If a listing doesn’t state something (e.g. color), the agent says so and points the customer to the photos or a quick photo check — it doesn’t speculate</w:t>
             </w:r>
           </w:p>
         </w:tc>
@@ -580,49 +580,49 @@
       <w:tr>
         <w:tc>
           <w:tcPr>
-            <w:tcW w:type="dxa" w:w="3200"/>
-            <w:tcMar>
-              <w:top w:type="dxa" w:w="70"/>
-              <w:left w:type="dxa" w:w="110"/>
-              <w:bottom w:type="dxa" w:w="70"/>
-              <w:right w:type="dxa" w:w="110"/>
-            </w:tcMar>
-          </w:tcPr>
-          <w:p>
-            <w:r>
-              <w:rPr>
-                <w:rFonts w:ascii="Calibri" w:cs="Calibri" w:eastAsia="Calibri" w:hAnsi="Calibri"/>
-                <w:b w:val="false"/>
-                <w:bCs w:val="false"/>
-                <w:color w:val="222222"/>
-                <w:sz w:val="19"/>
-                <w:szCs w:val="19"/>
-              </w:rPr>
-              <w:t xml:space="preserve">Photos it hasn’t seen</w:t>
-            </w:r>
-          </w:p>
-        </w:tc>
-        <w:tc>
-          <w:tcPr>
-            <w:tcW w:type="dxa" w:w="6300"/>
-            <w:tcMar>
-              <w:top w:type="dxa" w:w="70"/>
-              <w:left w:type="dxa" w:w="110"/>
-              <w:bottom w:type="dxa" w:w="70"/>
-              <w:right w:type="dxa" w:w="110"/>
-            </w:tcMar>
-          </w:tcPr>
-          <w:p>
-            <w:r>
-              <w:rPr>
-                <w:rFonts w:ascii="Calibri" w:cs="Calibri" w:eastAsia="Calibri" w:hAnsi="Calibri"/>
-                <w:b w:val="false"/>
-                <w:bCs w:val="false"/>
-                <w:color w:val="222222"/>
-                <w:sz w:val="19"/>
-                <w:szCs w:val="19"/>
-              </w:rPr>
-              <w:t xml:space="preserve">Never claims to see listing photos; only customer-uploaded images are analyzed</w:t>
+            <w:tcW w:type="dxa" w:w="2600"/>
+            <w:tcMar>
+              <w:top w:type="dxa" w:w="70"/>
+              <w:left w:type="dxa" w:w="110"/>
+              <w:bottom w:type="dxa" w:w="70"/>
+              <w:right w:type="dxa" w:w="110"/>
+            </w:tcMar>
+          </w:tcPr>
+          <w:p>
+            <w:r>
+              <w:rPr>
+                <w:rFonts w:ascii="Calibri" w:cs="Calibri" w:eastAsia="Calibri" w:hAnsi="Calibri"/>
+                <w:b w:val="false"/>
+                <w:bCs w:val="false"/>
+                <w:color w:val="222222"/>
+                <w:sz w:val="19"/>
+                <w:szCs w:val="19"/>
+              </w:rPr>
+              <w:t xml:space="preserve">Customer data</w:t>
+            </w:r>
+          </w:p>
+        </w:tc>
+        <w:tc>
+          <w:tcPr>
+            <w:tcW w:type="dxa" w:w="6900"/>
+            <w:tcMar>
+              <w:top w:type="dxa" w:w="70"/>
+              <w:left w:type="dxa" w:w="110"/>
+              <w:bottom w:type="dxa" w:w="70"/>
+              <w:right w:type="dxa" w:w="110"/>
+            </w:tcMar>
+          </w:tcPr>
+          <w:p>
+            <w:r>
+              <w:rPr>
+                <w:rFonts w:ascii="Calibri" w:cs="Calibri" w:eastAsia="Calibri" w:hAnsi="Calibri"/>
+                <w:b w:val="false"/>
+                <w:bCs w:val="false"/>
+                <w:color w:val="222222"/>
+                <w:sz w:val="19"/>
+                <w:szCs w:val="19"/>
+              </w:rPr>
+              <w:t xml:space="preserve">Only a name and phone number are collected; transcripts are automatically redacted; payment and ID data are never requested</w:t>
             </w:r>
           </w:p>
         </w:tc>
@@ -630,49 +630,49 @@
       <w:tr>
         <w:tc>
           <w:tcPr>
-            <w:tcW w:type="dxa" w:w="3200"/>
-            <w:tcMar>
-              <w:top w:type="dxa" w:w="70"/>
-              <w:left w:type="dxa" w:w="110"/>
-              <w:bottom w:type="dxa" w:w="70"/>
-              <w:right w:type="dxa" w:w="110"/>
-            </w:tcMar>
-          </w:tcPr>
-          <w:p>
-            <w:r>
-              <w:rPr>
-                <w:rFonts w:ascii="Calibri" w:cs="Calibri" w:eastAsia="Calibri" w:hAnsi="Calibri"/>
-                <w:b w:val="false"/>
-                <w:bCs w:val="false"/>
-                <w:color w:val="222222"/>
-                <w:sz w:val="19"/>
-                <w:szCs w:val="19"/>
-              </w:rPr>
-              <w:t xml:space="preserve">Reference numbers</w:t>
-            </w:r>
-          </w:p>
-        </w:tc>
-        <w:tc>
-          <w:tcPr>
-            <w:tcW w:type="dxa" w:w="6300"/>
-            <w:tcMar>
-              <w:top w:type="dxa" w:w="70"/>
-              <w:left w:type="dxa" w:w="110"/>
-              <w:bottom w:type="dxa" w:w="70"/>
-              <w:right w:type="dxa" w:w="110"/>
-            </w:tcMar>
-          </w:tcPr>
-          <w:p>
-            <w:r>
-              <w:rPr>
-                <w:rFonts w:ascii="Calibri" w:cs="Calibri" w:eastAsia="Calibri" w:hAnsi="Calibri"/>
-                <w:b w:val="false"/>
-                <w:bCs w:val="false"/>
-                <w:color w:val="222222"/>
-                <w:sz w:val="19"/>
-                <w:szCs w:val="19"/>
-              </w:rPr>
-              <w:t xml:space="preserve">Only the exact tool-returned LD- reference, verbatim — never invented</w:t>
+            <w:tcW w:type="dxa" w:w="2600"/>
+            <w:tcMar>
+              <w:top w:type="dxa" w:w="70"/>
+              <w:left w:type="dxa" w:w="110"/>
+              <w:bottom w:type="dxa" w:w="70"/>
+              <w:right w:type="dxa" w:w="110"/>
+            </w:tcMar>
+          </w:tcPr>
+          <w:p>
+            <w:r>
+              <w:rPr>
+                <w:rFonts w:ascii="Calibri" w:cs="Calibri" w:eastAsia="Calibri" w:hAnsi="Calibri"/>
+                <w:b w:val="false"/>
+                <w:bCs w:val="false"/>
+                <w:color w:val="222222"/>
+                <w:sz w:val="19"/>
+                <w:szCs w:val="19"/>
+              </w:rPr>
+              <w:t xml:space="preserve">Security</w:t>
+            </w:r>
+          </w:p>
+        </w:tc>
+        <w:tc>
+          <w:tcPr>
+            <w:tcW w:type="dxa" w:w="6900"/>
+            <w:tcMar>
+              <w:top w:type="dxa" w:w="70"/>
+              <w:left w:type="dxa" w:w="110"/>
+              <w:bottom w:type="dxa" w:w="70"/>
+              <w:right w:type="dxa" w:w="110"/>
+            </w:tcMar>
+          </w:tcPr>
+          <w:p>
+            <w:r>
+              <w:rPr>
+                <w:rFonts w:ascii="Calibri" w:cs="Calibri" w:eastAsia="Calibri" w:hAnsi="Calibri"/>
+                <w:b w:val="false"/>
+                <w:bCs w:val="false"/>
+                <w:color w:val="222222"/>
+                <w:sz w:val="19"/>
+                <w:szCs w:val="19"/>
+              </w:rPr>
+              <w:t xml:space="preserve">Resistant to prompt-injection attempts; internal configuration is never disclosed</w:t>
             </w:r>
           </w:p>
         </w:tc>
@@ -680,149 +680,49 @@
       <w:tr>
         <w:tc>
           <w:tcPr>
-            <w:tcW w:type="dxa" w:w="3200"/>
-            <w:tcMar>
-              <w:top w:type="dxa" w:w="70"/>
-              <w:left w:type="dxa" w:w="110"/>
-              <w:bottom w:type="dxa" w:w="70"/>
-              <w:right w:type="dxa" w:w="110"/>
-            </w:tcMar>
-          </w:tcPr>
-          <w:p>
-            <w:r>
-              <w:rPr>
-                <w:rFonts w:ascii="Calibri" w:cs="Calibri" w:eastAsia="Calibri" w:hAnsi="Calibri"/>
-                <w:b w:val="false"/>
-                <w:bCs w:val="false"/>
-                <w:color w:val="222222"/>
-                <w:sz w:val="19"/>
-                <w:szCs w:val="19"/>
-              </w:rPr>
-              <w:t xml:space="preserve">Prompt injection</w:t>
-            </w:r>
-          </w:p>
-        </w:tc>
-        <w:tc>
-          <w:tcPr>
-            <w:tcW w:type="dxa" w:w="6300"/>
-            <w:tcMar>
-              <w:top w:type="dxa" w:w="70"/>
-              <w:left w:type="dxa" w:w="110"/>
-              <w:bottom w:type="dxa" w:w="70"/>
-              <w:right w:type="dxa" w:w="110"/>
-            </w:tcMar>
-          </w:tcPr>
-          <w:p>
-            <w:r>
-              <w:rPr>
-                <w:rFonts w:ascii="Calibri" w:cs="Calibri" w:eastAsia="Calibri" w:hAnsi="Calibri"/>
-                <w:b w:val="false"/>
-                <w:bCs w:val="false"/>
-                <w:color w:val="222222"/>
-                <w:sz w:val="19"/>
-                <w:szCs w:val="19"/>
-              </w:rPr>
-              <w:t xml:space="preserve">Treated as untrusted data; instructions and tool internals never disclosed</w:t>
-            </w:r>
-          </w:p>
-        </w:tc>
-      </w:tr>
-      <w:tr>
-        <w:tc>
-          <w:tcPr>
-            <w:tcW w:type="dxa" w:w="3200"/>
-            <w:tcMar>
-              <w:top w:type="dxa" w:w="70"/>
-              <w:left w:type="dxa" w:w="110"/>
-              <w:bottom w:type="dxa" w:w="70"/>
-              <w:right w:type="dxa" w:w="110"/>
-            </w:tcMar>
-          </w:tcPr>
-          <w:p>
-            <w:r>
-              <w:rPr>
-                <w:rFonts w:ascii="Calibri" w:cs="Calibri" w:eastAsia="Calibri" w:hAnsi="Calibri"/>
-                <w:b w:val="false"/>
-                <w:bCs w:val="false"/>
-                <w:color w:val="222222"/>
-                <w:sz w:val="19"/>
-                <w:szCs w:val="19"/>
-              </w:rPr>
-              <w:t xml:space="preserve">Sensitive data</w:t>
-            </w:r>
-          </w:p>
-        </w:tc>
-        <w:tc>
-          <w:tcPr>
-            <w:tcW w:type="dxa" w:w="6300"/>
-            <w:tcMar>
-              <w:top w:type="dxa" w:w="70"/>
-              <w:left w:type="dxa" w:w="110"/>
-              <w:bottom w:type="dxa" w:w="70"/>
-              <w:right w:type="dxa" w:w="110"/>
-            </w:tcMar>
-          </w:tcPr>
-          <w:p>
-            <w:r>
-              <w:rPr>
-                <w:rFonts w:ascii="Calibri" w:cs="Calibri" w:eastAsia="Calibri" w:hAnsi="Calibri"/>
-                <w:b w:val="false"/>
-                <w:bCs w:val="false"/>
-                <w:color w:val="222222"/>
-                <w:sz w:val="19"/>
-                <w:szCs w:val="19"/>
-              </w:rPr>
-              <w:t xml:space="preserve">Only name + phone collected; transcripts DLP-redacted; no cards, IDs, passwords, ever</w:t>
-            </w:r>
-          </w:p>
-        </w:tc>
-      </w:tr>
-      <w:tr>
-        <w:tc>
-          <w:tcPr>
-            <w:tcW w:type="dxa" w:w="3200"/>
-            <w:tcMar>
-              <w:top w:type="dxa" w:w="70"/>
-              <w:left w:type="dxa" w:w="110"/>
-              <w:bottom w:type="dxa" w:w="70"/>
-              <w:right w:type="dxa" w:w="110"/>
-            </w:tcMar>
-          </w:tcPr>
-          <w:p>
-            <w:r>
-              <w:rPr>
-                <w:rFonts w:ascii="Calibri" w:cs="Calibri" w:eastAsia="Calibri" w:hAnsi="Calibri"/>
-                <w:b w:val="false"/>
-                <w:bCs w:val="false"/>
-                <w:color w:val="222222"/>
-                <w:sz w:val="19"/>
-                <w:szCs w:val="19"/>
-              </w:rPr>
-              <w:t xml:space="preserve">Out of scope (jobs, weather…)</w:t>
-            </w:r>
-          </w:p>
-        </w:tc>
-        <w:tc>
-          <w:tcPr>
-            <w:tcW w:type="dxa" w:w="6300"/>
-            <w:tcMar>
-              <w:top w:type="dxa" w:w="70"/>
-              <w:left w:type="dxa" w:w="110"/>
-              <w:bottom w:type="dxa" w:w="70"/>
-              <w:right w:type="dxa" w:w="110"/>
-            </w:tcMar>
-          </w:tcPr>
-          <w:p>
-            <w:r>
-              <w:rPr>
-                <w:rFonts w:ascii="Calibri" w:cs="Calibri" w:eastAsia="Calibri" w:hAnsi="Calibri"/>
-                <w:b w:val="false"/>
-                <w:bCs w:val="false"/>
-                <w:color w:val="222222"/>
-                <w:sz w:val="19"/>
-                <w:szCs w:val="19"/>
-              </w:rPr>
-              <w:t xml:space="preserve">One-line decline, steered back to vehicle import</w:t>
+            <w:tcW w:type="dxa" w:w="2600"/>
+            <w:tcMar>
+              <w:top w:type="dxa" w:w="70"/>
+              <w:left w:type="dxa" w:w="110"/>
+              <w:bottom w:type="dxa" w:w="70"/>
+              <w:right w:type="dxa" w:w="110"/>
+            </w:tcMar>
+          </w:tcPr>
+          <w:p>
+            <w:r>
+              <w:rPr>
+                <w:rFonts w:ascii="Calibri" w:cs="Calibri" w:eastAsia="Calibri" w:hAnsi="Calibri"/>
+                <w:b w:val="false"/>
+                <w:bCs w:val="false"/>
+                <w:color w:val="222222"/>
+                <w:sz w:val="19"/>
+                <w:szCs w:val="19"/>
+              </w:rPr>
+              <w:t xml:space="preserve">Scope</w:t>
+            </w:r>
+          </w:p>
+        </w:tc>
+        <w:tc>
+          <w:tcPr>
+            <w:tcW w:type="dxa" w:w="6900"/>
+            <w:tcMar>
+              <w:top w:type="dxa" w:w="70"/>
+              <w:left w:type="dxa" w:w="110"/>
+              <w:bottom w:type="dxa" w:w="70"/>
+              <w:right w:type="dxa" w:w="110"/>
+            </w:tcMar>
+          </w:tcPr>
+          <w:p>
+            <w:r>
+              <w:rPr>
+                <w:rFonts w:ascii="Calibri" w:cs="Calibri" w:eastAsia="Calibri" w:hAnsi="Calibri"/>
+                <w:b w:val="false"/>
+                <w:bCs w:val="false"/>
+                <w:color w:val="222222"/>
+                <w:sz w:val="19"/>
+                <w:szCs w:val="19"/>
+              </w:rPr>
+              <w:t xml:space="preserve">Politely declines unrelated requests and returns the conversation to vehicle import</w:t>
             </w:r>
           </w:p>
         </w:tc>
@@ -1001,7 +901,7 @@
                 <w:sz w:val="17"/>
                 <w:szCs w:val="17"/>
               </w:rPr>
-              <w:t xml:space="preserve">hardened instructions · guardrails · lot memory</w:t>
+              <w:t xml:space="preserve">conversation design · guardrails · memory</w:t>
             </w:r>
           </w:p>
         </w:tc>
@@ -1352,7 +1252,7 @@
           <w:sz w:val="21"/>
           <w:szCs w:val="21"/>
         </w:rPr>
-        <w:t xml:space="preserve">One root agent on CX Agent Studio with hardened instructions (honesty, lot memory, no-fabrication, verbatim references) plus safety guardrails and DLP redaction; changes ship as versioned deployments.</w:t>
+        <w:t xml:space="preserve">One root agent on CX Agent Studio with carefully engineered instructions (grounded answers, conversation memory, consistent references) plus safety guardrails and automatic transcript redaction; changes ship as versioned deployments.</w:t>
       </w:r>
     </w:p>
     <w:p>
@@ -1408,7 +1308,7 @@
           <w:sz w:val="21"/>
           <w:szCs w:val="21"/>
         </w:rPr>
-        <w:t xml:space="preserve">The agent’s replies deliberately contain no URLs (voice would read them aloud); the website detects lot numbers in chat and renders the photo strip and auction button from its own data. Side effect: links can never be hallucinated, and fabricated cars get no visuals — a structural honesty backstop.</w:t>
+        <w:t xml:space="preserve">The agent’s replies contain no raw URLs (important for a clean voice experience); the website recognizes lot numbers in the conversation and renders each car’s photo strip and auction button directly from inventory data — so visuals stay consistent across the chat, the website, and the broker portal.</w:t>
       </w:r>
     </w:p>
     <w:p>

</xml_diff>